<commit_message>
feat(governance): update gitignore, untrack processing byproducts, calibrate shelf life, and add 25 enterprise policy suite
</commit_message>
<xml_diff>
--- a/india_monitor_data/rag/documents/Clinic SLA's/Platinum Tier Delivery & Delay Penalty Framework.docx
+++ b/india_monitor_data/rag/documents/Clinic SLA's/Platinum Tier Delivery & Delay Penalty Framework.docx
@@ -910,6 +910,54 @@
       </w:r>
     </w:p>
     <w:p xmlns:wp14="http://schemas.microsoft.com/office/word/2010/wordml" wp14:paraId="2C078E63" wp14:textId="470608E6"/>
+    <w:p>
+      <w:r>
+        <w:rPr>
+          <w:b/>
+          <w:color w:val="B40000"/>
+        </w:rPr>
+        <w:br/>
+        <w:t>[HARMONIZATION AMENDMENT - EXPEDITED RUSH EXCLUSION]:</w:t>
+        <w:br/>
+        <w:t>The 24-hour Grace Period outlined in Section 4.3 applies EXCLUSIVELY to Standard Sales Orders (AUART = 'OR'). For Expedited Rush Orders (AUART = 'RUSH'), the Grace Period is exactly ZERO (0) hours. Any delay beyond the established Promised Delivery Date immediately incurs the full $500.00/day Platinum delay penalty.</w:t>
+      </w:r>
+    </w:p>
+    <w:p>
+      <w:r>
+        <w:rPr>
+          <w:b/>
+          <w:color w:val="B40000"/>
+        </w:rPr>
+        <w:br/>
+        <w:t>[HARMONIZATION AMENDMENT - EXPEDITED RUSH EXCLUSION]:</w:t>
+        <w:br/>
+        <w:t>The 24-hour Grace Period outlined in Section 4.3 applies EXCLUSIVELY to Standard Sales Orders (AUART = 'OR'). For Expedited Rush Orders (AUART = 'RUSH'), the Grace Period is exactly ZERO (0) hours. Any delay beyond the established Promised Delivery Date immediately incurs the full $500.00/day Platinum delay penalty.</w:t>
+      </w:r>
+    </w:p>
+    <w:p>
+      <w:r>
+        <w:rPr>
+          <w:b/>
+          <w:color w:val="B40000"/>
+        </w:rPr>
+        <w:br/>
+        <w:t>[HARMONIZATION AMENDMENT - EXPEDITED RUSH EXCLUSION]:</w:t>
+        <w:br/>
+        <w:t>The 24-hour Grace Period outlined in Section 4.3 applies EXCLUSIVELY to Standard Sales Orders (AUART = 'OR'). For Expedited Rush Orders (AUART = 'RUSH'), the Grace Period is exactly ZERO (0) hours. Any delay beyond the established Promised Delivery Date immediately incurs the full $500.00/day Platinum delay penalty.</w:t>
+      </w:r>
+    </w:p>
+    <w:p>
+      <w:r>
+        <w:rPr>
+          <w:b/>
+          <w:color w:val="B40000"/>
+        </w:rPr>
+        <w:br/>
+        <w:t>[HARMONIZATION AMENDMENT - EXPEDITED RUSH EXCLUSION]:</w:t>
+        <w:br/>
+        <w:t>The 24-hour Grace Period outlined in Section 4.3 applies EXCLUSIVELY to Standard Sales Orders (AUART = 'OR'). For Expedited Rush Orders (AUART = 'RUSH'), the Grace Period is exactly ZERO (0) hours. Any delay beyond the established Promised Delivery Date immediately incurs the full $500.00/day Platinum delay penalty.</w:t>
+      </w:r>
+    </w:p>
     <w:sectPr>
       <w:pgSz w:w="12240" w:h="15840" w:orient="portrait"/>
       <w:pgMar w:top="1440" w:right="1440" w:bottom="1440" w:left="1440" w:header="720" w:footer="720" w:gutter="0"/>

</xml_diff>